<commit_message>
docs: atualizar relatorio docx com capturas de tela em alta resolucao e dados reais
</commit_message>
<xml_diff>
--- a/Relatorio_SteamTwo_Grupo.docx
+++ b/Relatorio_SteamTwo_Grupo.docx
@@ -593,12 +593,12 @@
         <w:pStyle w:val="Heading2"/>
       </w:pPr>
       <w:r>
-        <w:t>2. Busca com Autocomplete em Tempo Real no Header</w:t>
+        <w:t>2. Busca Espaçosa com Preview Rico de Resultados no Header</w:t>
       </w:r>
     </w:p>
     <w:p>
       <w:r>
-        <w:t>Mecanismo de busca instantânea integrado no cabeçalho com debounce de 200ms e AbortController. Ao digitar, o dropdown exibe miniaturas das capas dos jogos, nome, gênero, índice SteamTwo e permite navegar imediatamente pelo teclado (Enter/Esc) ou clique.</w:t>
+        <w:t>Barra de pesquisa integrada e ampliada no cabeçalho com debounce de 200ms e AbortController. Ao digitar, o dropdown exibe preview rico com miniatura da capa oficial, nome, posição no ranking, resumo/tagline, tags de gênero, loja, jogadores ao vivo e índice SteamTwo.</w:t>
       </w:r>
     </w:p>
     <w:p>
@@ -915,7 +915,7 @@
               <w:rPr>
                 <w:sz w:val="17"/>
               </w:rPr>
-              <w:t>pagina de exploracao por categorias e endpoint /api/genres</w:t>
+              <w:t>endpoint /api/genres e agregacao de categorias de jogos</w:t>
             </w:r>
           </w:p>
         </w:tc>
@@ -1323,7 +1323,7 @@
     </w:p>
     <w:p>
       <w:r>
-        <w:t>Abaixo estão registradas as evidências visuais das páginas e funcionalidades em pleno funcionamento:</w:t>
+        <w:t>Abaixo estão registradas as evidências visuais em alta resolução das páginas e funcionalidades com dados reais em pleno funcionamento:</w:t>
       </w:r>
     </w:p>
     <w:p>
@@ -1335,7 +1335,7 @@
       <w:r>
         <w:drawing>
           <wp:inline xmlns:a="http://schemas.openxmlformats.org/drawingml/2006/main" xmlns:pic="http://schemas.openxmlformats.org/drawingml/2006/picture">
-            <wp:extent cx="5486400" cy="3857625"/>
+            <wp:extent cx="5486400" cy="3643312"/>
             <wp:docPr id="1" name="Picture 1"/>
             <wp:cNvGraphicFramePr>
               <a:graphicFrameLocks noChangeAspect="1"/>
@@ -1356,7 +1356,7 @@
                   <pic:spPr>
                     <a:xfrm>
                       <a:off x="0" y="0"/>
-                      <a:ext cx="5486400" cy="3857625"/>
+                      <a:ext cx="5486400" cy="3643312"/>
                     </a:xfrm>
                     <a:prstGeom prst="rect"/>
                   </pic:spPr>
@@ -1390,7 +1390,7 @@
       <w:r>
         <w:drawing>
           <wp:inline xmlns:a="http://schemas.openxmlformats.org/drawingml/2006/main" xmlns:pic="http://schemas.openxmlformats.org/drawingml/2006/picture">
-            <wp:extent cx="5486400" cy="3857625"/>
+            <wp:extent cx="5486400" cy="3643312"/>
             <wp:docPr id="2" name="Picture 2"/>
             <wp:cNvGraphicFramePr>
               <a:graphicFrameLocks noChangeAspect="1"/>
@@ -1411,7 +1411,7 @@
                   <pic:spPr>
                     <a:xfrm>
                       <a:off x="0" y="0"/>
-                      <a:ext cx="5486400" cy="3857625"/>
+                      <a:ext cx="5486400" cy="3643312"/>
                     </a:xfrm>
                     <a:prstGeom prst="rect"/>
                   </pic:spPr>
@@ -1433,7 +1433,7 @@
           <w:color w:val="64748B"/>
           <w:sz w:val="18"/>
         </w:rPr>
-        <w:t>Figura 2: Catálogo de Jogos unificado com barra compacta e enxuta de filtros por gênero.</w:t>
+        <w:t>Figura 2: Catálogo de Jogos unificado com barra compacta e enxuta de filtros por categoria.</w:t>
       </w:r>
     </w:p>
     <w:p>
@@ -1445,7 +1445,7 @@
       <w:r>
         <w:drawing>
           <wp:inline xmlns:a="http://schemas.openxmlformats.org/drawingml/2006/main" xmlns:pic="http://schemas.openxmlformats.org/drawingml/2006/picture">
-            <wp:extent cx="5486400" cy="3857625"/>
+            <wp:extent cx="5486400" cy="3643312"/>
             <wp:docPr id="3" name="Picture 3"/>
             <wp:cNvGraphicFramePr>
               <a:graphicFrameLocks noChangeAspect="1"/>
@@ -1454,7 +1454,7 @@
               <a:graphicData uri="http://schemas.openxmlformats.org/drawingml/2006/picture">
                 <pic:pic>
                   <pic:nvPicPr>
-                    <pic:cNvPr id="0" name="rankings.png"/>
+                    <pic:cNvPr id="0" name="search_preview.png"/>
                     <pic:cNvPicPr/>
                   </pic:nvPicPr>
                   <pic:blipFill>
@@ -1466,7 +1466,7 @@
                   <pic:spPr>
                     <a:xfrm>
                       <a:off x="0" y="0"/>
-                      <a:ext cx="5486400" cy="3857625"/>
+                      <a:ext cx="5486400" cy="3643312"/>
                     </a:xfrm>
                     <a:prstGeom prst="rect"/>
                   </pic:spPr>
@@ -1488,7 +1488,7 @@
           <w:color w:val="64748B"/>
           <w:sz w:val="18"/>
         </w:rPr>
-        <w:t>Figura 3: Página de Rankings Oficiais com abas de período, filtros de loja e tabela interativa.</w:t>
+        <w:t>Figura 3: Busca ampliada no cabeçalho com menu suspenso de preview rico de resultados.</w:t>
       </w:r>
     </w:p>
     <w:p>
@@ -1500,7 +1500,7 @@
       <w:r>
         <w:drawing>
           <wp:inline xmlns:a="http://schemas.openxmlformats.org/drawingml/2006/main" xmlns:pic="http://schemas.openxmlformats.org/drawingml/2006/picture">
-            <wp:extent cx="5486400" cy="3857625"/>
+            <wp:extent cx="5486400" cy="3643312"/>
             <wp:docPr id="4" name="Picture 4"/>
             <wp:cNvGraphicFramePr>
               <a:graphicFrameLocks noChangeAspect="1"/>
@@ -1509,7 +1509,7 @@
               <a:graphicData uri="http://schemas.openxmlformats.org/drawingml/2006/picture">
                 <pic:pic>
                   <pic:nvPicPr>
-                    <pic:cNvPr id="0" name="compare.png"/>
+                    <pic:cNvPr id="0" name="rankings.png"/>
                     <pic:cNvPicPr/>
                   </pic:nvPicPr>
                   <pic:blipFill>
@@ -1521,7 +1521,7 @@
                   <pic:spPr>
                     <a:xfrm>
                       <a:off x="0" y="0"/>
-                      <a:ext cx="5486400" cy="3857625"/>
+                      <a:ext cx="5486400" cy="3643312"/>
                     </a:xfrm>
                     <a:prstGeom prst="rect"/>
                   </pic:spPr>
@@ -1543,7 +1543,7 @@
           <w:color w:val="64748B"/>
           <w:sz w:val="18"/>
         </w:rPr>
-        <w:t>Figura 4: Comparador de Jogos com duelo estatístico, barras de progresso e destaque de vencedores.</w:t>
+        <w:t>Figura 4: Rankings Oficiais com abas de período, filtros de loja e medalhas de pódio.</w:t>
       </w:r>
     </w:p>
     <w:p>
@@ -1555,7 +1555,7 @@
       <w:r>
         <w:drawing>
           <wp:inline xmlns:a="http://schemas.openxmlformats.org/drawingml/2006/main" xmlns:pic="http://schemas.openxmlformats.org/drawingml/2006/picture">
-            <wp:extent cx="5486400" cy="3857625"/>
+            <wp:extent cx="5486400" cy="3643312"/>
             <wp:docPr id="5" name="Picture 5"/>
             <wp:cNvGraphicFramePr>
               <a:graphicFrameLocks noChangeAspect="1"/>
@@ -1564,7 +1564,7 @@
               <a:graphicData uri="http://schemas.openxmlformats.org/drawingml/2006/picture">
                 <pic:pic>
                   <pic:nvPicPr>
-                    <pic:cNvPr id="0" name="detail.png"/>
+                    <pic:cNvPr id="0" name="compare.png"/>
                     <pic:cNvPicPr/>
                   </pic:nvPicPr>
                   <pic:blipFill>
@@ -1576,7 +1576,7 @@
                   <pic:spPr>
                     <a:xfrm>
                       <a:off x="0" y="0"/>
-                      <a:ext cx="5486400" cy="3857625"/>
+                      <a:ext cx="5486400" cy="3643312"/>
                     </a:xfrm>
                     <a:prstGeom prst="rect"/>
                   </pic:spPr>
@@ -1598,7 +1598,7 @@
           <w:color w:val="64748B"/>
           <w:sz w:val="18"/>
         </w:rPr>
-        <w:t>Figura 5: Página de Detalhes com Gráfico SVG de Evolução Histórica e recomendações de jogos.</w:t>
+        <w:t>Figura 5: Comparador de Jogos com duelo estatístico, barras de progresso e destaque de vencedores.</w:t>
       </w:r>
     </w:p>
     <w:p>
@@ -1610,7 +1610,7 @@
       <w:r>
         <w:drawing>
           <wp:inline xmlns:a="http://schemas.openxmlformats.org/drawingml/2006/main" xmlns:pic="http://schemas.openxmlformats.org/drawingml/2006/picture">
-            <wp:extent cx="5486400" cy="3857625"/>
+            <wp:extent cx="5486400" cy="3643312"/>
             <wp:docPr id="6" name="Picture 6"/>
             <wp:cNvGraphicFramePr>
               <a:graphicFrameLocks noChangeAspect="1"/>
@@ -1619,7 +1619,7 @@
               <a:graphicData uri="http://schemas.openxmlformats.org/drawingml/2006/picture">
                 <pic:pic>
                   <pic:nvPicPr>
-                    <pic:cNvPr id="0" name="mylist.png"/>
+                    <pic:cNvPr id="0" name="detail.png"/>
                     <pic:cNvPicPr/>
                   </pic:nvPicPr>
                   <pic:blipFill>
@@ -1631,7 +1631,7 @@
                   <pic:spPr>
                     <a:xfrm>
                       <a:off x="0" y="0"/>
-                      <a:ext cx="5486400" cy="3857625"/>
+                      <a:ext cx="5486400" cy="3643312"/>
                     </a:xfrm>
                     <a:prstGeom prst="rect"/>
                   </pic:spPr>
@@ -1653,7 +1653,62 @@
           <w:color w:val="64748B"/>
           <w:sz w:val="18"/>
         </w:rPr>
-        <w:t>Figura 6: Página Minha Lista com jogos favoritados pelo usuário e persistência local.</w:t>
+        <w:t>Figura 6: Página de Detalhes com Gráfico SVG de Evolução Histórica do Ranking.</w:t>
+      </w:r>
+    </w:p>
+    <w:p>
+      <w:pPr>
+        <w:jc w:val="center"/>
+      </w:pPr>
+    </w:p>
+    <w:p>
+      <w:r>
+        <w:drawing>
+          <wp:inline xmlns:a="http://schemas.openxmlformats.org/drawingml/2006/main" xmlns:pic="http://schemas.openxmlformats.org/drawingml/2006/picture">
+            <wp:extent cx="5486400" cy="3643312"/>
+            <wp:docPr id="7" name="Picture 7"/>
+            <wp:cNvGraphicFramePr>
+              <a:graphicFrameLocks noChangeAspect="1"/>
+            </wp:cNvGraphicFramePr>
+            <a:graphic>
+              <a:graphicData uri="http://schemas.openxmlformats.org/drawingml/2006/picture">
+                <pic:pic>
+                  <pic:nvPicPr>
+                    <pic:cNvPr id="0" name="mylist.png"/>
+                    <pic:cNvPicPr/>
+                  </pic:nvPicPr>
+                  <pic:blipFill>
+                    <a:blip r:embed="rId15"/>
+                    <a:stretch>
+                      <a:fillRect/>
+                    </a:stretch>
+                  </pic:blipFill>
+                  <pic:spPr>
+                    <a:xfrm>
+                      <a:off x="0" y="0"/>
+                      <a:ext cx="5486400" cy="3643312"/>
+                    </a:xfrm>
+                    <a:prstGeom prst="rect"/>
+                  </pic:spPr>
+                </pic:pic>
+              </a:graphicData>
+            </a:graphic>
+          </wp:inline>
+        </w:drawing>
+      </w:r>
+    </w:p>
+    <w:p>
+      <w:pPr>
+        <w:spacing w:after="280"/>
+        <w:jc w:val="center"/>
+      </w:pPr>
+      <w:r>
+        <w:rPr>
+          <w:i/>
+          <w:color w:val="64748B"/>
+          <w:sz w:val="18"/>
+        </w:rPr>
+        <w:t>Figura 7: Página Minha Lista com jogos favoritados pelo usuário e persistência local.</w:t>
       </w:r>
     </w:p>
     <w:p>

</xml_diff>